<commit_message>
refactor(lab5): make lab5 purely static HTML/CSS with zero JS, move mobile drawer to lab6/mobile-responsive-version
</commit_message>
<xml_diff>
--- a/FirstSemester/web/lab5/07_report/Лемішка_ПП-24_Л5_ChargeUA.docx
+++ b/FirstSemester/web/lab5/07_report/Лемішка_ПП-24_Л5_ChargeUA.docx
@@ -2387,8 +2387,6 @@
         <w:br/>
         <w:t>• css/style.css (та styles.css) — таблиця стилів із токенами, Flexbox та Grid;</w:t>
         <w:br/>
-        <w:t>• js/nav.js — ванільний модуль мобільної навігації (доступне меню-гамбургер);</w:t>
-        <w:br/>
         <w:t>• assets/ — графічні активи (Logo.svg, іконки, промо-банер ai_promo_banner.jpg, карта map_lviv.jpg);</w:t>
         <w:br/>
         <w:t>• screenshots/ — зафіксовані скріншоти тестування та промптів.</w:t>
@@ -4301,7 +4299,7 @@
           <w:color w:val="000000"/>
           <w:sz w:val="24"/>
         </w:rPr>
-        <w:t>4. Оптимізовано мобільний адаптивний перехід: поріг перемикання на бургер-меню встановлено на 1160px.</w:t>
+        <w:t>4. Оптимізовано компонування шапки: структура побудована за допомогою чистого CSS Flexbox із логотипом зліва, горизонтальною навігацією по центру та кнопками дій справа; відсутні сторонні JS-скрипти чи складні мобільні меню, оскільки повноцінна мобільна компонентна адаптивність є завданням наступної ЛР №6.</w:t>
       </w:r>
     </w:p>
     <w:p>
@@ -5088,7 +5086,7 @@
       <w:r>
         <w:drawing>
           <wp:inline xmlns:a="http://schemas.openxmlformats.org/drawingml/2006/main" xmlns:pic="http://schemas.openxmlformats.org/drawingml/2006/picture">
-            <wp:extent cx="3108960" cy="1399032"/>
+            <wp:extent cx="3108960" cy="1943100"/>
             <wp:docPr id="4" name="Picture 4"/>
             <wp:cNvGraphicFramePr>
               <a:graphicFrameLocks noChangeAspect="1"/>
@@ -5109,7 +5107,7 @@
                   <pic:spPr>
                     <a:xfrm>
                       <a:off x="0" y="0"/>
-                      <a:ext cx="3108960" cy="1399032"/>
+                      <a:ext cx="3108960" cy="1943100"/>
                     </a:xfrm>
                     <a:prstGeom prst="rect"/>
                   </pic:spPr>

</xml_diff>

<commit_message>
fix(hero): use authentic static hero_bg.jpg from materials in clean 2-column flexbox layout
</commit_message>
<xml_diff>
--- a/FirstSemester/web/lab5/07_report/Лемішка_ПП-24_Л5_ChargeUA.docx
+++ b/FirstSemester/web/lab5/07_report/Лемішка_ПП-24_Л5_ChargeUA.docx
@@ -3534,7 +3534,7 @@
           <w:color w:val="000000"/>
           <w:sz w:val="24"/>
         </w:rPr>
-        <w:t>3. Головний блок (.hero-sec) — відтворено оригінальний макет ЛР №4 із промо-банером (assets/images/ai_promo_banner.jpg) та градієнтним затемненням (fade overlay).</w:t>
+        <w:t>3. Головний блок (.hero-sec) — відтворено оригінальний макет ЛР №4 із текстовим контентом зліва та статичним зображенням станції справа (assets/images/hero_bg.jpg) за допомогою Flexbox.</w:t>
       </w:r>
     </w:p>
     <w:p>
@@ -3672,7 +3672,7 @@
               <w:br/>
               <w:t>Використай дизайн систему: Primary: #0077E6, Secondary: #0F172A, Background: #FFFFFF, Heading font: 'Raleway', Body font: 'Inter'.</w:t>
               <w:br/>
-              <w:t>Десктоп: текстовий контент зліва, графічний банер справа з напівпрозорим градієнтним переходом (fade overlay).</w:t>
+              <w:t>Десктоп: текстовий контент зліва, зображення справа (assets/images/hero_bg.jpg).</w:t>
               <w:br/>
               <w:t>Використовуй Flexbox. Не змінюй інші секції. Не використовуй фреймворків Tailwind або Bootstrap.»</w:t>
             </w:r>

</xml_diff>

<commit_message>
feat(hero): integrate hero_bg.jpg directly as CSS background-image matching Figma design
</commit_message>
<xml_diff>
--- a/FirstSemester/web/lab5/07_report/Лемішка_ПП-24_Л5_ChargeUA.docx
+++ b/FirstSemester/web/lab5/07_report/Лемішка_ПП-24_Л5_ChargeUA.docx
@@ -3024,11 +3024,11 @@
               <a:graphicData uri="http://schemas.openxmlformats.org/drawingml/2006/picture">
                 <pic:pic>
                   <pic:nvPicPr>
-                    <pic:cNvPr id="0" name="00_vscode_environment.png"/>
+                    <pic:cNvPr id="0" name="03_vscode_css_tokens.png"/>
                     <pic:cNvPicPr/>
                   </pic:nvPicPr>
                   <pic:blipFill>
-                    <a:blip r:embed="rId9"/>
+                    <a:blip r:embed="rId10"/>
                     <a:stretch>
                       <a:fillRect/>
                     </a:stretch>
@@ -3534,7 +3534,7 @@
           <w:color w:val="000000"/>
           <w:sz w:val="24"/>
         </w:rPr>
-        <w:t>3. Головний блок (.hero-sec) — відтворено оригінальний макет ЛР №4 із текстовим контентом зліва та статичним зображенням станції справа (assets/images/hero_bg.jpg) за допомогою Flexbox.</w:t>
+        <w:t>3. Головний блок (.hero-sec) — відтворено оригінальний макет ЛР №4 із розміщенням автентичного зображення станції (assets/images/hero_bg.jpg) безпосередньо у фоні секції за допомогою чистого CSS (background-image) та плавного градієнтного переходу.</w:t>
       </w:r>
     </w:p>
     <w:p>
@@ -3672,7 +3672,7 @@
               <w:br/>
               <w:t>Використай дизайн систему: Primary: #0077E6, Secondary: #0F172A, Background: #FFFFFF, Heading font: 'Raleway', Body font: 'Inter'.</w:t>
               <w:br/>
-              <w:t>Десктоп: текстовий контент зліва, зображення справа (assets/images/hero_bg.jpg).</w:t>
+              <w:t>Десктоп: текстовий контент зліва на чистому фоні, автентичне зображення станції у фоні справа (background-image: assets/images/hero_bg.jpg).</w:t>
               <w:br/>
               <w:t>Використовуй Flexbox. Не змінюй інші секції. Не використовуй фреймворків Tailwind або Bootstrap.»</w:t>
             </w:r>
@@ -5041,7 +5041,7 @@
                     <pic:cNvPicPr/>
                   </pic:nvPicPr>
                   <pic:blipFill>
-                    <a:blip r:embed="rId10"/>
+                    <a:blip r:embed="rId11"/>
                     <a:stretch>
                       <a:fillRect/>
                     </a:stretch>
@@ -5099,7 +5099,7 @@
                     <pic:cNvPicPr/>
                   </pic:nvPicPr>
                   <pic:blipFill>
-                    <a:blip r:embed="rId11"/>
+                    <a:blip r:embed="rId12"/>
                     <a:stretch>
                       <a:fillRect/>
                     </a:stretch>
@@ -5202,7 +5202,7 @@
                           <pic:cNvPicPr/>
                         </pic:nvPicPr>
                         <pic:blipFill>
-                          <a:blip r:embed="rId12"/>
+                          <a:blip r:embed="rId13"/>
                           <a:stretch>
                             <a:fillRect/>
                           </a:stretch>
@@ -5270,7 +5270,7 @@
                           <pic:cNvPicPr/>
                         </pic:nvPicPr>
                         <pic:blipFill>
-                          <a:blip r:embed="rId13"/>
+                          <a:blip r:embed="rId14"/>
                           <a:stretch>
                             <a:fillRect/>
                           </a:stretch>
@@ -6014,7 +6014,7 @@
                           <pic:cNvPicPr/>
                         </pic:nvPicPr>
                         <pic:blipFill>
-                          <a:blip r:embed="rId14"/>
+                          <a:blip r:embed="rId15"/>
                           <a:stretch>
                             <a:fillRect/>
                           </a:stretch>
@@ -6082,7 +6082,7 @@
                           <pic:cNvPicPr/>
                         </pic:nvPicPr>
                         <pic:blipFill>
-                          <a:blip r:embed="rId15"/>
+                          <a:blip r:embed="rId16"/>
                           <a:stretch>
                             <a:fillRect/>
                           </a:stretch>
@@ -6147,7 +6147,7 @@
                     <pic:cNvPicPr/>
                   </pic:nvPicPr>
                   <pic:blipFill>
-                    <a:blip r:embed="rId16"/>
+                    <a:blip r:embed="rId17"/>
                     <a:stretch>
                       <a:fillRect/>
                     </a:stretch>
@@ -6238,7 +6238,7 @@
                     <pic:cNvPicPr/>
                   </pic:nvPicPr>
                   <pic:blipFill>
-                    <a:blip r:embed="rId17"/>
+                    <a:blip r:embed="rId18"/>
                     <a:stretch>
                       <a:fillRect/>
                     </a:stretch>
@@ -6358,7 +6358,7 @@
                           <pic:cNvPicPr/>
                         </pic:nvPicPr>
                         <pic:blipFill>
-                          <a:blip r:embed="rId18"/>
+                          <a:blip r:embed="rId19"/>
                           <a:stretch>
                             <a:fillRect/>
                           </a:stretch>
@@ -6426,7 +6426,7 @@
                           <pic:cNvPicPr/>
                         </pic:nvPicPr>
                         <pic:blipFill>
-                          <a:blip r:embed="rId19"/>
+                          <a:blip r:embed="rId20"/>
                           <a:stretch>
                             <a:fillRect/>
                           </a:stretch>
@@ -6491,7 +6491,7 @@
                     <pic:cNvPicPr/>
                   </pic:nvPicPr>
                   <pic:blipFill>
-                    <a:blip r:embed="rId20"/>
+                    <a:blip r:embed="rId21"/>
                     <a:stretch>
                       <a:fillRect/>
                     </a:stretch>

</xml_diff>

<commit_message>
feat(lab6): align Lab 6 strictly with ChargeUA website components, authentic map, and official report format
</commit_message>
<xml_diff>
--- a/FirstSemester/web/lab5/07_report/Лемішка_ПП-24_Л5_ChargeUA.docx
+++ b/FirstSemester/web/lab5/07_report/Лемішка_ПП-24_Л5_ChargeUA.docx
@@ -116,6 +116,13 @@
       <w:pPr>
         <w:spacing w:after="1200"/>
         <w:jc w:val="center"/>
+        <w:rPr>
+          <w:rFonts w:ascii="Times New Roman" w:hAnsi="Times New Roman" w:cs="Times New Roman"/>
+          <w:b/>
+          <w:color w:val="000000"/>
+          <w:sz w:val="23"/>
+          <w:lang w:val="uk-UA"/>
+        </w:rPr>
       </w:pPr>
       <w:r>
         <w:rPr>
@@ -135,6 +142,38 @@
         </w:rPr>
         <w:br/>
         <w:t>«Вебплатформа ChargeUA — мережа швидкісних зарядних комплексів для електромобілів в Україні»</w:t>
+      </w:r>
+    </w:p>
+    <w:p>
+      <w:pPr>
+        <w:spacing w:after="1200"/>
+        <w:jc w:val="center"/>
+        <w:rPr>
+          <w:rFonts w:ascii="Times New Roman" w:hAnsi="Times New Roman" w:cs="Times New Roman"/>
+          <w:b/>
+          <w:color w:val="000000"/>
+          <w:sz w:val="23"/>
+          <w:lang w:val="uk-UA"/>
+        </w:rPr>
+      </w:pPr>
+    </w:p>
+    <w:p>
+      <w:pPr>
+        <w:spacing w:after="1200"/>
+        <w:jc w:val="center"/>
+        <w:rPr>
+          <w:lang w:val="uk-UA"/>
+        </w:rPr>
+      </w:pPr>
+      <w:r>
+        <w:rPr>
+          <w:rFonts w:ascii="Times New Roman" w:hAnsi="Times New Roman" w:cs="Times New Roman"/>
+          <w:b/>
+          <w:color w:val="000000"/>
+          <w:sz w:val="23"/>
+          <w:lang w:val="uk-UA"/>
+        </w:rPr>
+        <w:tab/>
       </w:r>
     </w:p>
     <w:p>

</xml_diff>